<commit_message>
feat: recommandation d'offres selon le CV + score & retour IA visibles (entreprise/ecole)
Recommandations - endpoint /me/recommended-jobs (matching mots-cles du CV vs titre+categorie+lieu) ; section 'Offres recommandees' dans le dashboard candidat (en plus des formations).

IA - score (badge colore) + 'Retour IA' (feedback libelle) affiches a l'entreprise (JobApplicants) et a l'ecole (SessionApplicants), avec gestion 'pas de CV' / 'analyse en cours'.

Docs - ETAT_AVANCEMENT, RESUME_1PAGE, ARCHITECTURE, README maj (recommandations, analytics par offre/formation owner+admin, score IA visible, filtre niveau) ; dossier Word IQRA_Dossier_BusinessPlan.docx regenere.

Co-Authored-By: Claude Opus 4.8 <noreply@anthropic.com>
</commit_message>
<xml_diff>
--- a/IQRA_Dossier_BusinessPlan.docx
+++ b/IQRA_Dossier_BusinessPlan.docx
@@ -114,7 +114,6 @@
     <w:p>
       <w:pPr>
         <w:spacing w:after="160"/>
-        <w:jc w:val="left"/>
       </w:pPr>
       <w:r>
         <w:rPr>
@@ -560,7 +559,37 @@
         <w:t xml:space="preserve">IA</w:t>
       </w:r>
       <w:r>
-        <w:t xml:space="preserve"> : score + retour sur chaque candidature ; l'humain décide (accepter / en attente / refuser).</w:t>
+        <w:t xml:space="preserve"> : score + retour sur chaque candidature (</w:t>
+      </w:r>
+      <w:r>
+        <w:rPr>
+          <w:b/>
+          <w:bCs/>
+        </w:rPr>
+        <w:t xml:space="preserve">visibles par l'entreprise / l'école</w:t>
+      </w:r>
+      <w:r>
+        <w:t xml:space="preserve">) ; l'humain décide. </w:t>
+      </w:r>
+      <w:r>
+        <w:rPr>
+          <w:b/>
+          <w:bCs/>
+        </w:rPr>
+        <w:t xml:space="preserve">Recommandations</w:t>
+      </w:r>
+      <w:r>
+        <w:t xml:space="preserve"> : à l'ajout d'un CV, analyse automatique → </w:t>
+      </w:r>
+      <w:r>
+        <w:rPr>
+          <w:b/>
+          <w:bCs/>
+        </w:rPr>
+        <w:t xml:space="preserve">offres et formations recommandées</w:t>
+      </w:r>
+      <w:r>
+        <w:t xml:space="preserve"> selon spécialité, catégorie et niveau d'études.</w:t>
       </w:r>
     </w:p>
     <w:p>
@@ -580,17 +609,27 @@
         <w:t xml:space="preserve">Tableaux de bord entreprise/école</w:t>
       </w:r>
       <w:r>
-        <w:t xml:space="preserve"> (web + mobile) : vues, </w:t>
-      </w:r>
-      <w:r>
-        <w:rPr>
-          <w:b/>
-          <w:bCs/>
-        </w:rPr>
-        <w:t xml:space="preserve">taux de conversion</w:t>
-      </w:r>
-      <w:r>
-        <w:t xml:space="preserve">, candidats actifs, top offres/formations, candidatures récentes.</w:t>
+        <w:t xml:space="preserve"> (web + mobile) : </w:t>
+      </w:r>
+      <w:r>
+        <w:rPr>
+          <w:b/>
+          <w:bCs/>
+        </w:rPr>
+        <w:t xml:space="preserve">détail par offre / formation</w:t>
+      </w:r>
+      <w:r>
+        <w:t xml:space="preserve"> (vues · candidatures/inscriptions · acceptées · conversion), candidats actifs, candidatures récentes — </w:t>
+      </w:r>
+      <w:r>
+        <w:rPr>
+          <w:b/>
+          <w:bCs/>
+        </w:rPr>
+        <w:t xml:space="preserve">aussi accessibles à l'admin</w:t>
+      </w:r>
+      <w:r>
+        <w:t xml:space="preserve"> via la fiche entreprise/école.</w:t>
       </w:r>
     </w:p>
     <w:p>
@@ -1939,7 +1978,17 @@
         <w:t xml:space="preserve">retour IA</w:t>
       </w:r>
       <w:r>
-        <w:t xml:space="preserve"> (analyse du CV vs. l'offre).</w:t>
+        <w:t xml:space="preserve"> (analyse du CV vs. l'offre), </w:t>
+      </w:r>
+      <w:r>
+        <w:rPr>
+          <w:b/>
+          <w:bCs/>
+        </w:rPr>
+        <w:t xml:space="preserve">affichés à l'entreprise / l'école</w:t>
+      </w:r>
+      <w:r>
+        <w:t xml:space="preserve"> sur chaque candidature pour les aider à décider.</w:t>
       </w:r>
     </w:p>
     <w:p>
@@ -1977,14 +2026,6 @@
     </w:p>
     <w:p>
       <w:pPr>
-        <w:pStyle w:val="Heading3"/>
-      </w:pPr>
-      <w:r>
-        <w:t xml:space="preserve">Tableaux de bord &amp; statistiques (entreprise / école)</w:t>
-      </w:r>
-    </w:p>
-    <w:p>
-      <w:pPr>
         <w:pStyle w:val="ListParagraph"/>
         <w:numPr>
           <w:ilvl w:val="0"/>
@@ -1997,30 +2038,10 @@
           <w:b/>
           <w:bCs/>
         </w:rPr>
-        <w:t xml:space="preserve">Statistiques en temps réel</w:t>
-      </w:r>
-      <w:r>
-        <w:t xml:space="preserve"> : nombre d'offres/formations, </w:t>
-      </w:r>
-      <w:r>
-        <w:rPr>
-          <w:b/>
-          <w:bCs/>
-        </w:rPr>
-        <w:t xml:space="preserve">vues cumulées</w:t>
-      </w:r>
-      <w:r>
-        <w:t xml:space="preserve">, candidatures (en attente / acceptées), </w:t>
-      </w:r>
-      <w:r>
-        <w:rPr>
-          <w:b/>
-          <w:bCs/>
-        </w:rPr>
-        <w:t xml:space="preserve">candidats actifs (30 jours)</w:t>
-      </w:r>
-      <w:r>
-        <w:t xml:space="preserve">.</w:t>
+        <w:t xml:space="preserve">Analyse du CV dès l'ajout au profil</w:t>
+      </w:r>
+      <w:r>
+        <w:t xml:space="preserve"> : compétences, formation et niveau sont extraits automatiquement.</w:t>
       </w:r>
     </w:p>
     <w:p>
@@ -2037,20 +2058,48 @@
           <w:b/>
           <w:bCs/>
         </w:rPr>
-        <w:t xml:space="preserve">Top offres / formations</w:t>
-      </w:r>
-      <w:r>
-        <w:t xml:space="preserve"> avec </w:t>
-      </w:r>
-      <w:r>
-        <w:rPr>
-          <w:b/>
-          <w:bCs/>
-        </w:rPr>
-        <w:t xml:space="preserve">taux de conversion</w:t>
-      </w:r>
-      <w:r>
-        <w:t xml:space="preserve"> (vues → candidatures).</w:t>
+        <w:t xml:space="preserve">Recommandations personnalisées</w:t>
+      </w:r>
+      <w:r>
+        <w:t xml:space="preserve"> : à partir du CV analysé, le candidat reçoit des </w:t>
+      </w:r>
+      <w:r>
+        <w:rPr>
+          <w:b/>
+          <w:bCs/>
+        </w:rPr>
+        <w:t xml:space="preserve">offres d'emploi et des formations recommandées</w:t>
+      </w:r>
+      <w:r>
+        <w:t xml:space="preserve"> selon sa </w:t>
+      </w:r>
+      <w:r>
+        <w:rPr>
+          <w:b/>
+          <w:bCs/>
+        </w:rPr>
+        <w:t xml:space="preserve">spécialité / catégorie</w:t>
+      </w:r>
+      <w:r>
+        <w:t xml:space="preserve"> et son </w:t>
+      </w:r>
+      <w:r>
+        <w:rPr>
+          <w:b/>
+          <w:bCs/>
+        </w:rPr>
+        <w:t xml:space="preserve">niveau d'études</w:t>
+      </w:r>
+      <w:r>
+        <w:t xml:space="preserve">.</w:t>
+      </w:r>
+    </w:p>
+    <w:p>
+      <w:pPr>
+        <w:pStyle w:val="Heading3"/>
+      </w:pPr>
+      <w:r>
+        <w:t xml:space="preserve">Tableaux de bord &amp; statistiques (entreprise / école)</w:t>
       </w:r>
     </w:p>
     <w:p>
@@ -2067,10 +2116,140 @@
           <w:b/>
           <w:bCs/>
         </w:rPr>
+        <w:t xml:space="preserve">Statistiques en temps réel</w:t>
+      </w:r>
+      <w:r>
+        <w:t xml:space="preserve"> : nombre d'offres/formations, </w:t>
+      </w:r>
+      <w:r>
+        <w:rPr>
+          <w:b/>
+          <w:bCs/>
+        </w:rPr>
+        <w:t xml:space="preserve">vues cumulées</w:t>
+      </w:r>
+      <w:r>
+        <w:t xml:space="preserve">, candidatures (en attente / acceptées), </w:t>
+      </w:r>
+      <w:r>
+        <w:rPr>
+          <w:b/>
+          <w:bCs/>
+        </w:rPr>
+        <w:t xml:space="preserve">candidats actifs (30 jours)</w:t>
+      </w:r>
+      <w:r>
+        <w:t xml:space="preserve">.</w:t>
+      </w:r>
+    </w:p>
+    <w:p>
+      <w:pPr>
+        <w:pStyle w:val="ListParagraph"/>
+        <w:numPr>
+          <w:ilvl w:val="0"/>
+          <w:numId w:val="2"/>
+        </w:numPr>
+        <w:spacing w:after="40"/>
+      </w:pPr>
+      <w:r>
+        <w:rPr>
+          <w:b/>
+          <w:bCs/>
+        </w:rPr>
+        <w:t xml:space="preserve">Détail par offre et par formation</w:t>
+      </w:r>
+      <w:r>
+        <w:t xml:space="preserve"> : </w:t>
+      </w:r>
+      <w:r>
+        <w:rPr>
+          <w:b/>
+          <w:bCs/>
+        </w:rPr>
+        <w:t xml:space="preserve">vues · candidatures/inscriptions · acceptées</w:t>
+      </w:r>
+      <w:r>
+        <w:t xml:space="preserve"> + </w:t>
+      </w:r>
+      <w:r>
+        <w:rPr>
+          <w:b/>
+          <w:bCs/>
+        </w:rPr>
+        <w:t xml:space="preserve">taux de conversion</w:t>
+      </w:r>
+      <w:r>
+        <w:t xml:space="preserve"> (vues → candidatures), ligne par ligne.</w:t>
+      </w:r>
+    </w:p>
+    <w:p>
+      <w:pPr>
+        <w:pStyle w:val="ListParagraph"/>
+        <w:numPr>
+          <w:ilvl w:val="0"/>
+          <w:numId w:val="2"/>
+        </w:numPr>
+        <w:spacing w:after="40"/>
+      </w:pPr>
+      <w:r>
+        <w:rPr>
+          <w:b/>
+          <w:bCs/>
+        </w:rPr>
         <w:t xml:space="preserve">Candidatures récentes</w:t>
       </w:r>
       <w:r>
         <w:t xml:space="preserve"> d'un coup d'œil.</w:t>
+      </w:r>
+    </w:p>
+    <w:p>
+      <w:pPr>
+        <w:pStyle w:val="ListParagraph"/>
+        <w:numPr>
+          <w:ilvl w:val="0"/>
+          <w:numId w:val="2"/>
+        </w:numPr>
+        <w:spacing w:after="40"/>
+      </w:pPr>
+      <w:r>
+        <w:rPr>
+          <w:b/>
+          <w:bCs/>
+        </w:rPr>
+        <w:t xml:space="preserve">L'administrateur</w:t>
+      </w:r>
+      <w:r>
+        <w:t xml:space="preserve"> accède à cette analyse pour </w:t>
+      </w:r>
+      <w:r>
+        <w:rPr>
+          <w:b/>
+          <w:bCs/>
+        </w:rPr>
+        <w:t xml:space="preserve">chaque entreprise / école</w:t>
+      </w:r>
+      <w:r>
+        <w:t xml:space="preserve"> depuis sa fiche dans le back-office.</w:t>
+      </w:r>
+    </w:p>
+    <w:p>
+      <w:pPr>
+        <w:pStyle w:val="ListParagraph"/>
+        <w:numPr>
+          <w:ilvl w:val="0"/>
+          <w:numId w:val="2"/>
+        </w:numPr>
+        <w:spacing w:after="40"/>
+      </w:pPr>
+      <w:r>
+        <w:rPr>
+          <w:b/>
+          <w:bCs/>
+        </w:rPr>
+        <w:t xml:space="preserve">Recherche de formations filtrable par niveau d'études</w:t>
+      </w:r>
+      <w:r>
+        <w:t xml:space="preserve"> (en plus de la catégorie et du type).</w:t>
       </w:r>
     </w:p>
     <w:p>
@@ -2881,6 +3060,234 @@
             </w:pPr>
             <w:r>
               <w:t xml:space="preserve">Tableaux de bord &amp; statistiques (web + Flutter)</w:t>
+            </w:r>
+          </w:p>
+        </w:tc>
+        <w:tc>
+          <w:tcPr>
+            <w:tcW w:type="dxa" w:w="4513"/>
+            <w:tcBorders>
+              <w:top w:val="single" w:color="CCCCCC" w:sz="1"/>
+              <w:left w:val="single" w:color="CCCCCC" w:sz="1"/>
+              <w:bottom w:val="single" w:color="CCCCCC" w:sz="1"/>
+              <w:right w:val="single" w:color="CCCCCC" w:sz="1"/>
+            </w:tcBorders>
+            <w:tcMar>
+              <w:top w:type="dxa" w:w="60"/>
+              <w:left w:type="dxa" w:w="110"/>
+              <w:bottom w:type="dxa" w:w="60"/>
+              <w:right w:type="dxa" w:w="110"/>
+            </w:tcMar>
+            <w:vAlign w:val="center"/>
+          </w:tcPr>
+          <w:p>
+            <w:pPr>
+              <w:spacing w:after="0"/>
+            </w:pPr>
+            <w:r>
+              <w:t xml:space="preserve">✅ Opérationnel</w:t>
+            </w:r>
+          </w:p>
+        </w:tc>
+      </w:tr>
+      <w:tr>
+        <w:trPr>
+          <w:tblHeader w:val="false"/>
+        </w:trPr>
+        <w:tc>
+          <w:tcPr>
+            <w:tcW w:type="dxa" w:w="4513"/>
+            <w:tcBorders>
+              <w:top w:val="single" w:color="CCCCCC" w:sz="1"/>
+              <w:left w:val="single" w:color="CCCCCC" w:sz="1"/>
+              <w:bottom w:val="single" w:color="CCCCCC" w:sz="1"/>
+              <w:right w:val="single" w:color="CCCCCC" w:sz="1"/>
+            </w:tcBorders>
+            <w:tcMar>
+              <w:top w:type="dxa" w:w="60"/>
+              <w:left w:type="dxa" w:w="110"/>
+              <w:bottom w:type="dxa" w:w="60"/>
+              <w:right w:type="dxa" w:w="110"/>
+            </w:tcMar>
+            <w:vAlign w:val="center"/>
+          </w:tcPr>
+          <w:p>
+            <w:pPr>
+              <w:spacing w:after="0"/>
+            </w:pPr>
+            <w:r>
+              <w:t xml:space="preserve">Analytics détaillés par offre / formation (vues, candidatures, acceptées) — owner + admin</w:t>
+            </w:r>
+          </w:p>
+        </w:tc>
+        <w:tc>
+          <w:tcPr>
+            <w:tcW w:type="dxa" w:w="4513"/>
+            <w:tcBorders>
+              <w:top w:val="single" w:color="CCCCCC" w:sz="1"/>
+              <w:left w:val="single" w:color="CCCCCC" w:sz="1"/>
+              <w:bottom w:val="single" w:color="CCCCCC" w:sz="1"/>
+              <w:right w:val="single" w:color="CCCCCC" w:sz="1"/>
+            </w:tcBorders>
+            <w:tcMar>
+              <w:top w:type="dxa" w:w="60"/>
+              <w:left w:type="dxa" w:w="110"/>
+              <w:bottom w:type="dxa" w:w="60"/>
+              <w:right w:type="dxa" w:w="110"/>
+            </w:tcMar>
+            <w:vAlign w:val="center"/>
+          </w:tcPr>
+          <w:p>
+            <w:pPr>
+              <w:spacing w:after="0"/>
+            </w:pPr>
+            <w:r>
+              <w:t xml:space="preserve">✅ Opérationnel</w:t>
+            </w:r>
+          </w:p>
+        </w:tc>
+      </w:tr>
+      <w:tr>
+        <w:trPr>
+          <w:tblHeader w:val="false"/>
+        </w:trPr>
+        <w:tc>
+          <w:tcPr>
+            <w:tcW w:type="dxa" w:w="4513"/>
+            <w:tcBorders>
+              <w:top w:val="single" w:color="CCCCCC" w:sz="1"/>
+              <w:left w:val="single" w:color="CCCCCC" w:sz="1"/>
+              <w:bottom w:val="single" w:color="CCCCCC" w:sz="1"/>
+              <w:right w:val="single" w:color="CCCCCC" w:sz="1"/>
+            </w:tcBorders>
+            <w:tcMar>
+              <w:top w:type="dxa" w:w="60"/>
+              <w:left w:type="dxa" w:w="110"/>
+              <w:bottom w:type="dxa" w:w="60"/>
+              <w:right w:type="dxa" w:w="110"/>
+            </w:tcMar>
+            <w:vAlign w:val="center"/>
+          </w:tcPr>
+          <w:p>
+            <w:pPr>
+              <w:spacing w:after="0"/>
+            </w:pPr>
+            <w:r>
+              <w:t xml:space="preserve">Recommandations IA (offres + formations) selon le CV (spécialité, catégorie, niveau)</w:t>
+            </w:r>
+          </w:p>
+        </w:tc>
+        <w:tc>
+          <w:tcPr>
+            <w:tcW w:type="dxa" w:w="4513"/>
+            <w:tcBorders>
+              <w:top w:val="single" w:color="CCCCCC" w:sz="1"/>
+              <w:left w:val="single" w:color="CCCCCC" w:sz="1"/>
+              <w:bottom w:val="single" w:color="CCCCCC" w:sz="1"/>
+              <w:right w:val="single" w:color="CCCCCC" w:sz="1"/>
+            </w:tcBorders>
+            <w:tcMar>
+              <w:top w:type="dxa" w:w="60"/>
+              <w:left w:type="dxa" w:w="110"/>
+              <w:bottom w:type="dxa" w:w="60"/>
+              <w:right w:type="dxa" w:w="110"/>
+            </w:tcMar>
+            <w:vAlign w:val="center"/>
+          </w:tcPr>
+          <w:p>
+            <w:pPr>
+              <w:spacing w:after="0"/>
+            </w:pPr>
+            <w:r>
+              <w:t xml:space="preserve">✅ Opérationnel</w:t>
+            </w:r>
+          </w:p>
+        </w:tc>
+      </w:tr>
+      <w:tr>
+        <w:trPr>
+          <w:tblHeader w:val="false"/>
+        </w:trPr>
+        <w:tc>
+          <w:tcPr>
+            <w:tcW w:type="dxa" w:w="4513"/>
+            <w:tcBorders>
+              <w:top w:val="single" w:color="CCCCCC" w:sz="1"/>
+              <w:left w:val="single" w:color="CCCCCC" w:sz="1"/>
+              <w:bottom w:val="single" w:color="CCCCCC" w:sz="1"/>
+              <w:right w:val="single" w:color="CCCCCC" w:sz="1"/>
+            </w:tcBorders>
+            <w:tcMar>
+              <w:top w:type="dxa" w:w="60"/>
+              <w:left w:type="dxa" w:w="110"/>
+              <w:bottom w:type="dxa" w:w="60"/>
+              <w:right w:type="dxa" w:w="110"/>
+            </w:tcMar>
+            <w:vAlign w:val="center"/>
+          </w:tcPr>
+          <w:p>
+            <w:pPr>
+              <w:spacing w:after="0"/>
+            </w:pPr>
+            <w:r>
+              <w:t xml:space="preserve">Filtre par niveau d'études dans la recherche de formations</w:t>
+            </w:r>
+          </w:p>
+        </w:tc>
+        <w:tc>
+          <w:tcPr>
+            <w:tcW w:type="dxa" w:w="4513"/>
+            <w:tcBorders>
+              <w:top w:val="single" w:color="CCCCCC" w:sz="1"/>
+              <w:left w:val="single" w:color="CCCCCC" w:sz="1"/>
+              <w:bottom w:val="single" w:color="CCCCCC" w:sz="1"/>
+              <w:right w:val="single" w:color="CCCCCC" w:sz="1"/>
+            </w:tcBorders>
+            <w:tcMar>
+              <w:top w:type="dxa" w:w="60"/>
+              <w:left w:type="dxa" w:w="110"/>
+              <w:bottom w:type="dxa" w:w="60"/>
+              <w:right w:type="dxa" w:w="110"/>
+            </w:tcMar>
+            <w:vAlign w:val="center"/>
+          </w:tcPr>
+          <w:p>
+            <w:pPr>
+              <w:spacing w:after="0"/>
+            </w:pPr>
+            <w:r>
+              <w:t xml:space="preserve">✅ Opérationnel</w:t>
+            </w:r>
+          </w:p>
+        </w:tc>
+      </w:tr>
+      <w:tr>
+        <w:trPr>
+          <w:tblHeader w:val="false"/>
+        </w:trPr>
+        <w:tc>
+          <w:tcPr>
+            <w:tcW w:type="dxa" w:w="4513"/>
+            <w:tcBorders>
+              <w:top w:val="single" w:color="CCCCCC" w:sz="1"/>
+              <w:left w:val="single" w:color="CCCCCC" w:sz="1"/>
+              <w:bottom w:val="single" w:color="CCCCCC" w:sz="1"/>
+              <w:right w:val="single" w:color="CCCCCC" w:sz="1"/>
+            </w:tcBorders>
+            <w:tcMar>
+              <w:top w:type="dxa" w:w="60"/>
+              <w:left w:type="dxa" w:w="110"/>
+              <w:bottom w:type="dxa" w:w="60"/>
+              <w:right w:type="dxa" w:w="110"/>
+            </w:tcMar>
+            <w:vAlign w:val="center"/>
+          </w:tcPr>
+          <w:p>
+            <w:pPr>
+              <w:spacing w:after="0"/>
+            </w:pPr>
+            <w:r>
+              <w:t xml:space="preserve">Score &amp; retour IA visibles par l'entreprise / l'école</w:t>
             </w:r>
           </w:p>
         </w:tc>
@@ -7793,6 +8200,142 @@
           <w:szCs w:val="16"/>
         </w:rPr>
         <w:t xml:space="preserve">(sinon : refus)</w:t>
+      </w:r>
+    </w:p>
+    <w:p>
+      <w:pPr>
+        <w:spacing w:after="120"/>
+      </w:pPr>
+      <w:r>
+        <w:rPr>
+          <w:b/>
+          <w:bCs/>
+        </w:rPr>
+        <w:t xml:space="preserve">e) Recommandations à partir du CV</w:t>
+      </w:r>
+    </w:p>
+    <w:p>
+      <w:pPr>
+        <w:shd w:fill="F2F3F5" w:color="auto" w:val="clear"/>
+        <w:spacing w:after="0" w:line="240"/>
+      </w:pPr>
+      <w:r>
+        <w:rPr>
+          <w:rFonts w:ascii="Consolas" w:cs="Consolas" w:eastAsia="Consolas" w:hAnsi="Consolas"/>
+          <w:sz w:val="16"/>
+          <w:szCs w:val="16"/>
+        </w:rPr>
+        <w:t xml:space="preserve">Candidat ajoute un CV au profil</w:t>
+      </w:r>
+    </w:p>
+    <w:p>
+      <w:pPr>
+        <w:shd w:fill="F2F3F5" w:color="auto" w:val="clear"/>
+        <w:spacing w:after="0" w:line="240"/>
+      </w:pPr>
+      <w:r>
+        <w:rPr>
+          <w:rFonts w:ascii="Consolas" w:cs="Consolas" w:eastAsia="Consolas" w:hAnsi="Consolas"/>
+          <w:sz w:val="16"/>
+          <w:szCs w:val="16"/>
+        </w:rPr>
+        <w:t xml:space="preserve">→ analyse asynchrone du CV (compétences, formation, niveau)</w:t>
+      </w:r>
+    </w:p>
+    <w:p>
+      <w:pPr>
+        <w:shd w:fill="F2F3F5" w:color="auto" w:val="clear"/>
+        <w:spacing w:after="0" w:line="240"/>
+      </w:pPr>
+      <w:r>
+        <w:rPr>
+          <w:rFonts w:ascii="Consolas" w:cs="Consolas" w:eastAsia="Consolas" w:hAnsi="Consolas"/>
+          <w:sz w:val="16"/>
+          <w:szCs w:val="16"/>
+        </w:rPr>
+        <w:t xml:space="preserve">→ le candidat reçoit des OFFRES et des FORMATIONS recommandées,</w:t>
+      </w:r>
+    </w:p>
+    <w:p>
+      <w:pPr>
+        <w:shd w:fill="F2F3F5" w:color="auto" w:val="clear"/>
+        <w:spacing w:after="0" w:line="240"/>
+      </w:pPr>
+      <w:r>
+        <w:rPr>
+          <w:rFonts w:ascii="Consolas" w:cs="Consolas" w:eastAsia="Consolas" w:hAnsi="Consolas"/>
+          <w:sz w:val="16"/>
+          <w:szCs w:val="16"/>
+        </w:rPr>
+        <w:t xml:space="preserve">  selon sa spécialité / catégorie et son niveau d'études</w:t>
+      </w:r>
+    </w:p>
+    <w:p>
+      <w:pPr>
+        <w:shd w:fill="F2F3F5" w:color="auto" w:val="clear"/>
+        <w:spacing w:after="0" w:line="240"/>
+      </w:pPr>
+      <w:r>
+        <w:rPr>
+          <w:rFonts w:ascii="Consolas" w:cs="Consolas" w:eastAsia="Consolas" w:hAnsi="Consolas"/>
+          <w:sz w:val="16"/>
+          <w:szCs w:val="16"/>
+        </w:rPr>
+        <w:t xml:space="preserve">  (formations filtrées sur le niveau minimum requis)</w:t>
+      </w:r>
+    </w:p>
+    <w:p>
+      <w:pPr>
+        <w:spacing w:after="120"/>
+      </w:pPr>
+      <w:r>
+        <w:rPr>
+          <w:b/>
+          <w:bCs/>
+        </w:rPr>
+        <w:t xml:space="preserve">f) Analyse par offre / formation (tableaux de bord)</w:t>
+      </w:r>
+    </w:p>
+    <w:p>
+      <w:pPr>
+        <w:shd w:fill="F2F3F5" w:color="auto" w:val="clear"/>
+        <w:spacing w:after="0" w:line="240"/>
+      </w:pPr>
+      <w:r>
+        <w:rPr>
+          <w:rFonts w:ascii="Consolas" w:cs="Consolas" w:eastAsia="Consolas" w:hAnsi="Consolas"/>
+          <w:sz w:val="16"/>
+          <w:szCs w:val="16"/>
+        </w:rPr>
+        <w:t xml:space="preserve">Pour chaque offre / formation : vues + candidatures/inscriptions + acceptées</w:t>
+      </w:r>
+    </w:p>
+    <w:p>
+      <w:pPr>
+        <w:shd w:fill="F2F3F5" w:color="auto" w:val="clear"/>
+        <w:spacing w:after="0" w:line="240"/>
+      </w:pPr>
+      <w:r>
+        <w:rPr>
+          <w:rFonts w:ascii="Consolas" w:cs="Consolas" w:eastAsia="Consolas" w:hAnsi="Consolas"/>
+          <w:sz w:val="16"/>
+          <w:szCs w:val="16"/>
+        </w:rPr>
+        <w:t xml:space="preserve">→ affiché à l'entreprise / l'école dans son tableau de bord</w:t>
+      </w:r>
+    </w:p>
+    <w:p>
+      <w:pPr>
+        <w:shd w:fill="F2F3F5" w:color="auto" w:val="clear"/>
+        <w:spacing w:after="0" w:line="240"/>
+      </w:pPr>
+      <w:r>
+        <w:rPr>
+          <w:rFonts w:ascii="Consolas" w:cs="Consolas" w:eastAsia="Consolas" w:hAnsi="Consolas"/>
+          <w:sz w:val="16"/>
+          <w:szCs w:val="16"/>
+        </w:rPr>
+        <w:t xml:space="preserve">→ et à l'administrateur depuis la fiche entreprise / école (back-office)</w:t>
       </w:r>
     </w:p>
     <w:p>

</xml_diff>